<commit_message>
Minor changes to PDP and CVP lectures.
</commit_message>
<xml_diff>
--- a/CV Project/Small_Project_instructions.docx
+++ b/CV Project/Small_Project_instructions.docx
@@ -16,8 +16,13 @@
         <w:br/>
         <w:t>(</w:t>
       </w:r>
-      <w:r>
-        <w:t>MyModularMaster – Computer Vision</w:t>
+      <w:proofErr w:type="spellStart"/>
+      <w:r>
+        <w:t>MyModularMaster</w:t>
+      </w:r>
+      <w:proofErr w:type="spellEnd"/>
+      <w:r>
+        <w:t xml:space="preserve"> – Computer Vision</w:t>
       </w:r>
       <w:r>
         <w:t>)</w:t>
@@ -49,23 +54,63 @@
     <w:p/>
     <w:p>
       <w:r>
-        <w:t>In this project, you will have to design a deep learning model, whose task is to assist with the diagnosis of pneumonia, for COVID and non-COVID cases, by using X-ray images of patients. We will be working on a custom dataset, which has already been curated for you, so you do not have to bother with cumbersome image processing tasks, and can instead focus on your model design and training.</w:t>
-      </w:r>
-    </w:p>
-    <w:p>
-      <w:r>
-        <w:t>For this small project, we have purposely decided to guide you through the different steps one has to take when attempting to solve such a problem. Guided notebooks have been provided to get you familiar with the dataset and the concept of custom PyTorch datasets/dataloaders.</w:t>
-      </w:r>
-    </w:p>
-    <w:p>
-      <w:r>
-        <w:t>Once you have become familiar with the dateset, you may download the full dataset on</w:t>
+        <w:t xml:space="preserve">In this project, you will have to design a deep learning model, whose task is to assist with the diagnosis of pneumonia, for COVID and non-COVID cases, by using X-ray images of patients. We will be working on a custom dataset, which has already been curated for you, so you do not have to bother with cumbersome image processing </w:t>
+      </w:r>
+      <w:proofErr w:type="gramStart"/>
+      <w:r>
+        <w:t>tasks, and</w:t>
+      </w:r>
+      <w:proofErr w:type="gramEnd"/>
+      <w:r>
+        <w:t xml:space="preserve"> can instead focus on your model design and training.</w:t>
+      </w:r>
+    </w:p>
+    <w:p>
+      <w:r>
+        <w:t xml:space="preserve">For this project, we have purposely decided to guide you through the different steps one has to take when attempting to solve such a problem. Guided notebooks have been provided to get you familiar with the dataset and the concept of custom </w:t>
+      </w:r>
+      <w:proofErr w:type="spellStart"/>
+      <w:r>
+        <w:t>PyTorch</w:t>
+      </w:r>
+      <w:proofErr w:type="spellEnd"/>
+      <w:r>
+        <w:t xml:space="preserve"> datasets/</w:t>
+      </w:r>
+      <w:proofErr w:type="spellStart"/>
+      <w:r>
+        <w:t>dataloaders</w:t>
+      </w:r>
+      <w:proofErr w:type="spellEnd"/>
+      <w:r>
+        <w:t>.</w:t>
+      </w:r>
+    </w:p>
+    <w:p>
+      <w:r>
+        <w:t xml:space="preserve">Once you have become familiar with the </w:t>
+      </w:r>
+      <w:proofErr w:type="spellStart"/>
+      <w:r>
+        <w:t>dateset</w:t>
+      </w:r>
+      <w:proofErr w:type="spellEnd"/>
+      <w:r>
+        <w:t>, you may download the full dataset on</w:t>
       </w:r>
       <w:r>
         <w:t>line from our OneDrive repository</w:t>
       </w:r>
       <w:r>
-        <w:t xml:space="preserve">. You will have to create your custom datasets/dataloaders and may seek inspiration from the demonstration notebook. </w:t>
+        <w:t>. You will have to create your custom datasets/</w:t>
+      </w:r>
+      <w:proofErr w:type="spellStart"/>
+      <w:r>
+        <w:t>dataloaders</w:t>
+      </w:r>
+      <w:proofErr w:type="spellEnd"/>
+      <w:r>
+        <w:t xml:space="preserve"> and may seek inspiration from the demonstration notebook. </w:t>
       </w:r>
     </w:p>
     <w:p>
@@ -84,266 +129,451 @@
     </w:p>
     <w:p>
       <w:r>
-        <w:t>Finally, your submission will have to be uploaded for grading. Please only submit your code and notebooks, not the dataset! (Otherwise, the submission will be too large). We also advise to upload your final project on Github, to enrich your personal portfolio of projects</w:t>
-      </w:r>
-      <w:r>
+        <w:t>Finally, your submission will have to be uploaded for grading. Please only submit your code and notebooks</w:t>
+      </w:r>
+      <w:r>
+        <w:t xml:space="preserve"> only</w:t>
+      </w:r>
+      <w:r>
+        <w:t xml:space="preserve">, not the dataset! (Otherwise, the submission will be too large). </w:t>
+      </w:r>
+    </w:p>
+    <w:p/>
+    <w:p>
+      <w:pPr>
+        <w:pStyle w:val="Heading1"/>
+      </w:pPr>
+      <w:r>
+        <w:t>TLDR</w:t>
+      </w:r>
+    </w:p>
+    <w:p/>
+    <w:p>
+      <w:pPr>
+        <w:rPr>
+          <w:b/>
+          <w:bCs/>
+        </w:rPr>
+      </w:pPr>
+      <w:r>
+        <w:rPr>
+          <w:b/>
+          <w:bCs/>
+        </w:rPr>
+        <w:t xml:space="preserve">Submission deadline: </w:t>
+      </w:r>
+      <w:r>
+        <w:rPr>
+          <w:b/>
+          <w:bCs/>
+        </w:rPr>
+        <w:t>Sunday 3</w:t>
+      </w:r>
+      <w:r>
+        <w:rPr>
+          <w:b/>
+          <w:bCs/>
+          <w:vertAlign w:val="superscript"/>
+        </w:rPr>
+        <w:t>rd</w:t>
+      </w:r>
+      <w:r>
+        <w:rPr>
+          <w:b/>
+          <w:bCs/>
+        </w:rPr>
+        <w:t xml:space="preserve"> May 2026, 11.59pm</w:t>
+      </w:r>
+      <w:r>
+        <w:rPr>
+          <w:b/>
+          <w:bCs/>
+        </w:rPr>
         <w:t>.</w:t>
       </w:r>
-    </w:p>
-    <w:p>
-      <w:r>
-        <w:t>As a final note, keep in mind that this small project is designed as an introduction to the Big Project, to be announced later, will require more or less the same steps/concepts, but will be a lot less guided than this small project!</w:t>
-      </w:r>
+      <w:r>
+        <w:rPr>
+          <w:b/>
+          <w:bCs/>
+        </w:rPr>
+        <w:t xml:space="preserve"> Please </w:t>
+      </w:r>
+      <w:r>
+        <w:rPr>
+          <w:b/>
+          <w:bCs/>
+        </w:rPr>
+        <w:t xml:space="preserve">submit </w:t>
+      </w:r>
+      <w:r>
+        <w:rPr>
+          <w:b/>
+          <w:bCs/>
+        </w:rPr>
+        <w:t xml:space="preserve">your project </w:t>
+      </w:r>
+      <w:r>
+        <w:rPr>
+          <w:b/>
+          <w:bCs/>
+        </w:rPr>
+        <w:t>(code/notebooks + PDFs</w:t>
+      </w:r>
+      <w:r>
+        <w:rPr>
+          <w:b/>
+          <w:bCs/>
+        </w:rPr>
+        <w:t>)</w:t>
+      </w:r>
+      <w:r>
+        <w:rPr>
+          <w:b/>
+          <w:bCs/>
+        </w:rPr>
+        <w:t>, but no dataset due to space restrictions)</w:t>
+      </w:r>
+      <w:r>
+        <w:rPr>
+          <w:b/>
+          <w:bCs/>
+        </w:rPr>
+        <w:t xml:space="preserve"> via email at </w:t>
+      </w:r>
+      <w:hyperlink r:id="rId7" w:history="1">
+        <w:r>
+          <w:rPr>
+            <w:rStyle w:val="Hyperlink"/>
+            <w:b/>
+            <w:bCs/>
+          </w:rPr>
+          <w:t>matthieu_demari@sutd.edu.sg</w:t>
+        </w:r>
+      </w:hyperlink>
+      <w:r>
+        <w:rPr>
+          <w:b/>
+          <w:bCs/>
+        </w:rPr>
+        <w:t>.</w:t>
+      </w:r>
+    </w:p>
+    <w:p>
+      <w:pPr>
+        <w:rPr>
+          <w:b/>
+          <w:bCs/>
+        </w:rPr>
+      </w:pPr>
+      <w:r>
+        <w:rPr>
+          <w:b/>
+          <w:bCs/>
+        </w:rPr>
+        <w:t>There will also be a small presentation of your project on the 8</w:t>
+      </w:r>
+      <w:r>
+        <w:rPr>
+          <w:b/>
+          <w:bCs/>
+          <w:vertAlign w:val="superscript"/>
+        </w:rPr>
+        <w:t>th</w:t>
+      </w:r>
+      <w:r>
+        <w:rPr>
+          <w:b/>
+          <w:bCs/>
+        </w:rPr>
+        <w:t xml:space="preserve"> of May, details to follow later.</w:t>
+      </w:r>
+    </w:p>
+    <w:p>
+      <w:r>
+        <w:br w:type="page"/>
+      </w:r>
+    </w:p>
+    <w:p>
+      <w:pPr>
+        <w:pStyle w:val="Heading1"/>
+        <w:rPr>
+          <w:lang w:val="en-GB"/>
+        </w:rPr>
+      </w:pPr>
+      <w:r>
+        <w:rPr>
+          <w:lang w:val="en-GB"/>
+        </w:rPr>
+        <w:lastRenderedPageBreak/>
+        <w:t xml:space="preserve">Dataset and </w:t>
+      </w:r>
+      <w:proofErr w:type="spellStart"/>
+      <w:r>
+        <w:rPr>
+          <w:lang w:val="en-GB"/>
+        </w:rPr>
+        <w:t>Dataloader</w:t>
+      </w:r>
+      <w:proofErr w:type="spellEnd"/>
     </w:p>
     <w:p/>
     <w:p>
       <w:pPr>
-        <w:pStyle w:val="Heading1"/>
-      </w:pPr>
-      <w:r>
-        <w:t>TLDR</w:t>
+        <w:pStyle w:val="Heading2"/>
+      </w:pPr>
+      <w:r>
+        <w:t>Creating a custom Data</w:t>
+      </w:r>
+      <w:r>
+        <w:t>s</w:t>
+      </w:r>
+      <w:r>
+        <w:t xml:space="preserve">et and </w:t>
+      </w:r>
+      <w:proofErr w:type="spellStart"/>
+      <w:r>
+        <w:t>Data</w:t>
+      </w:r>
+      <w:r>
+        <w:t>l</w:t>
+      </w:r>
+      <w:r>
+        <w:t>oader</w:t>
+      </w:r>
+      <w:proofErr w:type="spellEnd"/>
+      <w:r>
+        <w:t xml:space="preserve"> on a mock dataset</w:t>
       </w:r>
     </w:p>
     <w:p/>
     <w:p>
       <w:r>
-        <w:t>Groups of 2-3 people</w:t>
-      </w:r>
+        <w:t xml:space="preserve">Your first task is to get familiar with the dataset, and the concepts of </w:t>
+      </w:r>
+      <w:proofErr w:type="spellStart"/>
+      <w:r>
+        <w:t>PyTorch</w:t>
+      </w:r>
+      <w:proofErr w:type="spellEnd"/>
+      <w:r>
+        <w:t xml:space="preserve"> Datasets/</w:t>
+      </w:r>
+      <w:proofErr w:type="spellStart"/>
+      <w:r>
+        <w:t>Dataloaders</w:t>
+      </w:r>
+      <w:proofErr w:type="spellEnd"/>
+      <w:r>
+        <w:t>. As we are playing with a custom dataset, which cannot be retrieved automatically using torch functions, like the MNIST dataset for instance, we will have to design our own datasets/</w:t>
+      </w:r>
+      <w:proofErr w:type="spellStart"/>
+      <w:r>
+        <w:t>dataloaders</w:t>
+      </w:r>
+      <w:proofErr w:type="spellEnd"/>
+      <w:r>
+        <w:t xml:space="preserve"> for this problem. </w:t>
+      </w:r>
+    </w:p>
+    <w:p>
+      <w:r>
+        <w:t xml:space="preserve">Refer to the </w:t>
+      </w:r>
+      <w:proofErr w:type="spellStart"/>
+      <w:r>
+        <w:t>Jupyter</w:t>
+      </w:r>
+      <w:proofErr w:type="spellEnd"/>
+      <w:r>
+        <w:t xml:space="preserve"> Notebook “</w:t>
+      </w:r>
+      <w:r>
+        <w:t xml:space="preserve">Creating a custom Dataset and </w:t>
+      </w:r>
+      <w:proofErr w:type="spellStart"/>
+      <w:r>
+        <w:t>DataLoader</w:t>
+      </w:r>
+      <w:proofErr w:type="spellEnd"/>
+      <w:r>
+        <w:t xml:space="preserve"> - Demonstration </w:t>
+      </w:r>
+      <w:proofErr w:type="spellStart"/>
+      <w:r>
+        <w:t>Notebook.ipynb</w:t>
+      </w:r>
+      <w:proofErr w:type="spellEnd"/>
+      <w:r>
+        <w:t xml:space="preserve"> for a demonstration of how to create your own custom dat</w:t>
+      </w:r>
+      <w:r>
+        <w:t>a</w:t>
+      </w:r>
+      <w:r>
+        <w:t xml:space="preserve">set and </w:t>
+      </w:r>
+      <w:proofErr w:type="spellStart"/>
+      <w:r>
+        <w:t>Dataloader</w:t>
+      </w:r>
+      <w:proofErr w:type="spellEnd"/>
+      <w:r>
+        <w:t xml:space="preserve"> objects.</w:t>
+      </w:r>
+      <w:r>
+        <w:t xml:space="preserve"> The notebook operates on a simplified version of the dataset, which is stored in the </w:t>
+      </w:r>
+      <w:proofErr w:type="spellStart"/>
+      <w:r>
+        <w:t>dataset_demo</w:t>
+      </w:r>
+      <w:proofErr w:type="spellEnd"/>
+      <w:r>
+        <w:t xml:space="preserve"> folder.</w:t>
+      </w:r>
+    </w:p>
+    <w:p/>
+    <w:p>
+      <w:pPr>
+        <w:pStyle w:val="Heading2"/>
+      </w:pPr>
+      <w:r>
+        <w:t>Project Dataset</w:t>
+      </w:r>
+    </w:p>
+    <w:p/>
+    <w:p>
+      <w:r>
+        <w:t xml:space="preserve">The </w:t>
+      </w:r>
+      <w:r>
+        <w:t xml:space="preserve">full </w:t>
+      </w:r>
+      <w:r>
+        <w:t>dataset</w:t>
+      </w:r>
+      <w:r>
+        <w:t xml:space="preserve"> to be used for this project</w:t>
+      </w:r>
+      <w:r>
+        <w:t xml:space="preserve">, is NOT contained in the </w:t>
+      </w:r>
+      <w:proofErr w:type="spellStart"/>
+      <w:r>
+        <w:t>dataset_demo</w:t>
+      </w:r>
+      <w:proofErr w:type="spellEnd"/>
+      <w:r>
+        <w:t xml:space="preserve"> folder. It</w:t>
+      </w:r>
+      <w:r>
+        <w:t xml:space="preserve"> </w:t>
+      </w:r>
+      <w:r>
+        <w:t>has to be downloaded online from</w:t>
+      </w:r>
+      <w:r>
+        <w:t xml:space="preserve"> </w:t>
+      </w:r>
+      <w:r>
+        <w:t>our</w:t>
+      </w:r>
+      <w:r>
+        <w:t xml:space="preserve"> </w:t>
+      </w:r>
+      <w:r>
+        <w:t>OneDrive</w:t>
+      </w:r>
+      <w:r>
+        <w:t xml:space="preserve">, </w:t>
+      </w:r>
+      <w:r>
+        <w:t xml:space="preserve">using </w:t>
+      </w:r>
+      <w:hyperlink r:id="rId8" w:history="1">
+        <w:r>
+          <w:rPr>
+            <w:rStyle w:val="Hyperlink"/>
+          </w:rPr>
+          <w:t xml:space="preserve">this </w:t>
+        </w:r>
+        <w:r>
+          <w:rPr>
+            <w:rStyle w:val="Hyperlink"/>
+          </w:rPr>
+          <w:t>l</w:t>
+        </w:r>
+        <w:r>
+          <w:rPr>
+            <w:rStyle w:val="Hyperlink"/>
+          </w:rPr>
+          <w:t>ink</w:t>
+        </w:r>
+      </w:hyperlink>
       <w:r>
         <w:t>.</w:t>
       </w:r>
     </w:p>
     <w:p>
-      <w:pPr>
-        <w:rPr>
-          <w:b/>
-          <w:bCs/>
-        </w:rPr>
-      </w:pPr>
-      <w:r>
-        <w:rPr>
-          <w:b/>
-          <w:bCs/>
-        </w:rPr>
-        <w:t xml:space="preserve">Submission deadline: </w:t>
-      </w:r>
-      <w:commentRangeStart w:id="0"/>
-      <w:r>
-        <w:rPr>
-          <w:b/>
-          <w:bCs/>
-        </w:rPr>
-        <w:t>XXX</w:t>
-      </w:r>
-      <w:r>
-        <w:rPr>
-          <w:b/>
-          <w:bCs/>
-        </w:rPr>
-        <w:t>.</w:t>
-      </w:r>
-      <w:commentRangeEnd w:id="0"/>
-      <w:r>
-        <w:rPr>
-          <w:rStyle w:val="CommentReference"/>
-          <w:b/>
-          <w:bCs/>
-          <w:sz w:val="22"/>
-          <w:szCs w:val="22"/>
-        </w:rPr>
-        <w:commentReference w:id="0"/>
-      </w:r>
-    </w:p>
-    <w:p>
-      <w:r>
-        <w:br w:type="page"/>
-      </w:r>
-    </w:p>
-    <w:p>
-      <w:pPr>
-        <w:pStyle w:val="Heading1"/>
-        <w:rPr>
-          <w:lang w:val="en-GB"/>
-        </w:rPr>
-      </w:pPr>
-      <w:r>
-        <w:rPr>
-          <w:lang w:val="en-GB"/>
-        </w:rPr>
-        <w:lastRenderedPageBreak/>
-        <w:t>Dataset and Dataloader</w:t>
-      </w:r>
-    </w:p>
-    <w:p/>
-    <w:p>
-      <w:pPr>
-        <w:pStyle w:val="Heading2"/>
-      </w:pPr>
-      <w:r>
-        <w:t>Creating a custom Data</w:t>
-      </w:r>
-      <w:r>
-        <w:t>s</w:t>
-      </w:r>
-      <w:r>
-        <w:t>et and Data</w:t>
-      </w:r>
-      <w:r>
-        <w:t>l</w:t>
-      </w:r>
-      <w:r>
-        <w:t>oader</w:t>
-      </w:r>
-      <w:r>
-        <w:t xml:space="preserve"> on a mock dataset</w:t>
-      </w:r>
-    </w:p>
-    <w:p/>
-    <w:p>
-      <w:r>
-        <w:t xml:space="preserve">Your first task is to get familiar with the dataset, and the concepts of PyTorch Datasets/Dataloaders. As we are playing with a custom dataset, which cannot be retrieved automatically using torch functions, like the MNIST dataset for instance, we will have to design our own datasets/dataloaders for this problem. </w:t>
-      </w:r>
-    </w:p>
-    <w:p>
-      <w:r>
-        <w:t>Refer to the Jupyter Notebook “</w:t>
-      </w:r>
-      <w:r>
-        <w:t>Creating a custom Dataset and DataLoader - Demonstration Notebook.ipynb</w:t>
-      </w:r>
-      <w:r>
-        <w:t xml:space="preserve"> for a demonstration of how to create your own custom dat</w:t>
-      </w:r>
-      <w:r>
-        <w:t>a</w:t>
-      </w:r>
-      <w:r>
-        <w:t>set and Dataloader objects.</w:t>
-      </w:r>
-      <w:r>
-        <w:t xml:space="preserve"> The notebook operates on a simplified version of the dataset, which is stored in the dataset_demo folder.</w:t>
-      </w:r>
-    </w:p>
-    <w:p/>
-    <w:p>
-      <w:pPr>
-        <w:pStyle w:val="Heading2"/>
-      </w:pPr>
-      <w:r>
-        <w:t>Small Project Dataset</w:t>
-      </w:r>
-    </w:p>
-    <w:p/>
-    <w:p>
-      <w:r>
-        <w:t xml:space="preserve">The </w:t>
-      </w:r>
-      <w:r>
-        <w:t xml:space="preserve">full </w:t>
-      </w:r>
-      <w:r>
-        <w:t>dataset</w:t>
-      </w:r>
-      <w:r>
-        <w:t xml:space="preserve"> to be used for this project</w:t>
-      </w:r>
-      <w:r>
-        <w:t>, is NOT contained in the dataset_demo folder. It</w:t>
+      <w:r>
+        <w:t xml:space="preserve">It contains thousands of 150 by 150 pixels images, </w:t>
+      </w:r>
+      <w:proofErr w:type="gramStart"/>
+      <w:r>
+        <w:t>similar to</w:t>
+      </w:r>
+      <w:proofErr w:type="gramEnd"/>
+      <w:r>
+        <w:t xml:space="preserve"> the ones found in the </w:t>
+      </w:r>
+      <w:r>
+        <w:t>demo/</w:t>
+      </w:r>
+      <w:r>
+        <w:t>mock dataset, but it has two major differences.</w:t>
+      </w:r>
+    </w:p>
+    <w:p>
+      <w:r>
+        <w:t>The first one is that it contains images with two labels</w:t>
+      </w:r>
+      <w:r>
+        <w:t xml:space="preserve">: </w:t>
+      </w:r>
+      <w:r>
+        <w:t>‘normal’ and ‘infected’ as in the mock dataset.</w:t>
       </w:r>
       <w:r>
         <w:t xml:space="preserve"> </w:t>
       </w:r>
       <w:r>
-        <w:t>has to be downloaded online from</w:t>
+        <w:t>The ‘infected’ class</w:t>
+      </w:r>
+      <w:r>
+        <w:t>,</w:t>
+      </w:r>
+      <w:r>
+        <w:t xml:space="preserve"> however</w:t>
+      </w:r>
+      <w:r>
+        <w:t>,</w:t>
+      </w:r>
+      <w:r>
+        <w:t xml:space="preserve"> has been split in two subclasses, ‘covid’ and ‘non-covid’.</w:t>
       </w:r>
       <w:r>
         <w:t xml:space="preserve"> </w:t>
       </w:r>
       <w:r>
-        <w:t>our</w:t>
-      </w:r>
-      <w:r>
-        <w:t xml:space="preserve"> </w:t>
-      </w:r>
-      <w:r>
-        <w:t>OneDrive</w:t>
-      </w:r>
-      <w:r>
-        <w:t xml:space="preserve">, </w:t>
-      </w:r>
-      <w:r>
-        <w:t xml:space="preserve">using </w:t>
-      </w:r>
-      <w:commentRangeStart w:id="1"/>
-      <w:r>
-        <w:fldChar w:fldCharType="begin"/>
-      </w:r>
-      <w:r>
-        <w:instrText>HYPERLINK "https://sutdapac-my.sharepoint.com/:u:/g/personal/matthieu_demari_sutd_edu_sg/EVoRmfA6jN5Br4STeo_QsHMBs7o54VeH37XQ_ZXfl2vuzw?e=k2uHup"</w:instrText>
-      </w:r>
-      <w:r>
-        <w:fldChar w:fldCharType="separate"/>
-      </w:r>
-      <w:r>
-        <w:rPr>
-          <w:rStyle w:val="Hyperlink"/>
-        </w:rPr>
-        <w:t>this link</w:t>
-      </w:r>
-      <w:r>
-        <w:fldChar w:fldCharType="end"/>
-      </w:r>
-      <w:r>
-        <w:t>.</w:t>
-      </w:r>
-      <w:commentRangeEnd w:id="1"/>
-      <w:r>
-        <w:rPr>
-          <w:rStyle w:val="CommentReference"/>
-          <w:sz w:val="22"/>
-          <w:szCs w:val="22"/>
-        </w:rPr>
-        <w:commentReference w:id="1"/>
-      </w:r>
-    </w:p>
-    <w:p>
-      <w:r>
-        <w:t>It contains thousands of 150 by 150 pixels images, similar to the ones found in the mock dataset, but it has two major differences.</w:t>
-      </w:r>
-    </w:p>
-    <w:p>
-      <w:r>
-        <w:t>The first one is that it contains images with two labels</w:t>
-      </w:r>
-      <w:r>
-        <w:t xml:space="preserve">: </w:t>
-      </w:r>
-      <w:r>
-        <w:t>‘normal’ and ‘infected’ as in the mock dataset.</w:t>
-      </w:r>
-      <w:r>
-        <w:t xml:space="preserve"> </w:t>
-      </w:r>
-      <w:r>
-        <w:t>The ‘infected’ class</w:t>
-      </w:r>
-      <w:r>
-        <w:t>,</w:t>
-      </w:r>
-      <w:r>
-        <w:t xml:space="preserve"> however</w:t>
-      </w:r>
-      <w:r>
-        <w:t>,</w:t>
-      </w:r>
-      <w:r>
-        <w:t xml:space="preserve"> has been split in two subclasses, ‘covid’ and ‘non-covid’.</w:t>
-      </w:r>
-      <w:r>
-        <w:t xml:space="preserve"> </w:t>
-      </w:r>
-      <w:r>
-        <w:t>The ‘covid’ labelled images consists of the x-ray images of patients, suffering from pneumonia and diagnosed with COVID-19. The ‘non-covid’, however, consists of the x-ray images of patients, suffering from pneumonia</w:t>
+        <w:t xml:space="preserve">The ‘covid’ labelled images </w:t>
+      </w:r>
+      <w:proofErr w:type="gramStart"/>
+      <w:r>
+        <w:t>consists</w:t>
+      </w:r>
+      <w:proofErr w:type="gramEnd"/>
+      <w:r>
+        <w:t xml:space="preserve"> of the x-ray images of patients, suffering from pneumonia and diagnosed with COVID-19. The ‘non-covid’, however, consists of the x-ray images of patients, suffering from pneumonia</w:t>
       </w:r>
       <w:r>
         <w:t xml:space="preserve">, probably due to bacteria, </w:t>
@@ -438,7 +668,15 @@
         </w:numPr>
       </w:pPr>
       <w:r>
-        <w:t>8 images for the val dataset, normal class,</w:t>
+        <w:t xml:space="preserve">8 images for the </w:t>
+      </w:r>
+      <w:proofErr w:type="spellStart"/>
+      <w:r>
+        <w:t>val</w:t>
+      </w:r>
+      <w:proofErr w:type="spellEnd"/>
+      <w:r>
+        <w:t xml:space="preserve"> dataset, normal class,</w:t>
       </w:r>
     </w:p>
     <w:p>
@@ -450,7 +688,15 @@
         </w:numPr>
       </w:pPr>
       <w:r>
-        <w:t>8 images for the val dataset, infected and non-covid class,</w:t>
+        <w:t xml:space="preserve">8 images for the </w:t>
+      </w:r>
+      <w:proofErr w:type="spellStart"/>
+      <w:r>
+        <w:t>val</w:t>
+      </w:r>
+      <w:proofErr w:type="spellEnd"/>
+      <w:r>
+        <w:t xml:space="preserve"> dataset, infected and non-covid class,</w:t>
       </w:r>
     </w:p>
     <w:p>
@@ -462,7 +708,15 @@
         </w:numPr>
       </w:pPr>
       <w:r>
-        <w:t>8 images for the val dataset, infected and covid class</w:t>
+        <w:t xml:space="preserve">8 images for the </w:t>
+      </w:r>
+      <w:proofErr w:type="spellStart"/>
+      <w:r>
+        <w:t>val</w:t>
+      </w:r>
+      <w:proofErr w:type="spellEnd"/>
+      <w:r>
+        <w:t xml:space="preserve"> dataset, infected and covid class</w:t>
       </w:r>
       <w:r>
         <w:t>.</w:t>
@@ -482,7 +736,7 @@
           <w:bCs/>
           <w:color w:val="FF0000"/>
         </w:rPr>
-        <w:t>Important note: you should not work on the mock dataset used for demo.</w:t>
+        <w:t>Important note: you should not work on the mock</w:t>
       </w:r>
       <w:r>
         <w:rPr>
@@ -490,6 +744,54 @@
           <w:bCs/>
           <w:color w:val="FF0000"/>
         </w:rPr>
+        <w:t>/demo</w:t>
+      </w:r>
+      <w:r>
+        <w:rPr>
+          <w:b/>
+          <w:bCs/>
+          <w:color w:val="FF0000"/>
+        </w:rPr>
+        <w:t xml:space="preserve"> dataset used </w:t>
+      </w:r>
+      <w:r>
+        <w:rPr>
+          <w:b/>
+          <w:bCs/>
+          <w:color w:val="FF0000"/>
+        </w:rPr>
+        <w:t>in the</w:t>
+      </w:r>
+      <w:r>
+        <w:rPr>
+          <w:b/>
+          <w:bCs/>
+          <w:color w:val="FF0000"/>
+        </w:rPr>
+        <w:t xml:space="preserve"> demo</w:t>
+      </w:r>
+      <w:r>
+        <w:rPr>
+          <w:b/>
+          <w:bCs/>
+          <w:color w:val="FF0000"/>
+        </w:rPr>
+        <w:t xml:space="preserve"> notebook</w:t>
+      </w:r>
+      <w:r>
+        <w:rPr>
+          <w:b/>
+          <w:bCs/>
+          <w:color w:val="FF0000"/>
+        </w:rPr>
+        <w:t>.</w:t>
+      </w:r>
+      <w:r>
+        <w:rPr>
+          <w:b/>
+          <w:bCs/>
+          <w:color w:val="FF0000"/>
+        </w:rPr>
         <w:br/>
       </w:r>
       <w:r>
@@ -537,7 +839,15 @@
       </w:pPr>
       <w:r>
         <w:lastRenderedPageBreak/>
-        <w:t>Expectations (Dataset and Dataloader)</w:t>
+        <w:t xml:space="preserve">Expectations (Dataset and </w:t>
+      </w:r>
+      <w:proofErr w:type="spellStart"/>
+      <w:r>
+        <w:t>Dataloader</w:t>
+      </w:r>
+      <w:proofErr w:type="spellEnd"/>
+      <w:r>
+        <w:t>)</w:t>
       </w:r>
     </w:p>
     <w:p/>
@@ -555,7 +865,15 @@
         </w:numPr>
       </w:pPr>
       <w:r>
-        <w:t>You are expected to write your own dataset and dataloader objects and may seek inspiration from the Demo Notebook discussed in Section 2.A.</w:t>
+        <w:t xml:space="preserve">You are expected to write your own dataset and </w:t>
+      </w:r>
+      <w:proofErr w:type="spellStart"/>
+      <w:r>
+        <w:t>dataloader</w:t>
+      </w:r>
+      <w:proofErr w:type="spellEnd"/>
+      <w:r>
+        <w:t xml:space="preserve"> objects and may seek inspiration from the Demo Notebook discussed in Section 2.A.</w:t>
       </w:r>
     </w:p>
     <w:p>
@@ -567,7 +885,15 @@
         </w:numPr>
       </w:pPr>
       <w:r>
-        <w:t>You are expected to explore the dataset slightly. Provide graphs showing the distribution of images among classes and discuss whether or not the dataset is balanced between classes, uniformly distributed, etc.</w:t>
+        <w:t xml:space="preserve">You are expected to explore the dataset slightly. Provide graphs showing the distribution of images among classes and discuss </w:t>
+      </w:r>
+      <w:proofErr w:type="gramStart"/>
+      <w:r>
+        <w:t>whether or not</w:t>
+      </w:r>
+      <w:proofErr w:type="gramEnd"/>
+      <w:r>
+        <w:t xml:space="preserve"> the dataset is balanced between classes, uniformly distributed, etc.</w:t>
       </w:r>
       <w:r>
         <w:t xml:space="preserve"> Curves like the one below would be much appreciated.</w:t>
@@ -597,7 +923,7 @@
                     <pic:cNvPicPr/>
                   </pic:nvPicPr>
                   <pic:blipFill>
-                    <a:blip r:embed="rId11">
+                    <a:blip r:embed="rId9">
                       <a:extLst>
                         <a:ext uri="{28A0092B-C50C-407E-A947-70E740481C1C}">
                           <a14:useLocalDpi xmlns:a14="http://schemas.microsoft.com/office/drawing/2010/main" val="0"/>
@@ -755,7 +1081,7 @@
                     <pic:cNvPicPr/>
                   </pic:nvPicPr>
                   <pic:blipFill>
-                    <a:blip r:embed="rId12">
+                    <a:blip r:embed="rId10">
                       <a:extLst>
                         <a:ext uri="{28A0092B-C50C-407E-A947-70E740481C1C}">
                           <a14:useLocalDpi xmlns:a14="http://schemas.microsoft.com/office/drawing/2010/main" val="0"/>
@@ -827,10 +1153,36 @@
         </w:numPr>
       </w:pPr>
       <w:r>
-        <w:t>The model should be designed as a subclass of the nn.Module class of the PyTorch library, as shown in the Demo notebook and multiple notebooks in class.</w:t>
-      </w:r>
-      <w:r>
-        <w:t xml:space="preserve"> You are free to decide on the architecture (types of layers, and their number of parameters), but are expected to discuss the reasons behind this choice of architecture.</w:t>
+        <w:t xml:space="preserve">The model should be designed as a subclass of the </w:t>
+      </w:r>
+      <w:proofErr w:type="spellStart"/>
+      <w:proofErr w:type="gramStart"/>
+      <w:r>
+        <w:t>nn.Module</w:t>
+      </w:r>
+      <w:proofErr w:type="spellEnd"/>
+      <w:proofErr w:type="gramEnd"/>
+      <w:r>
+        <w:t xml:space="preserve"> class of the </w:t>
+      </w:r>
+      <w:proofErr w:type="spellStart"/>
+      <w:r>
+        <w:t>PyTorch</w:t>
+      </w:r>
+      <w:proofErr w:type="spellEnd"/>
+      <w:r>
+        <w:t xml:space="preserve"> library, as shown in the Demo notebook and multiple notebooks in class.</w:t>
+      </w:r>
+      <w:r>
+        <w:t xml:space="preserve"> You are free to decide on the architecture (types of layers, and their number of parameters</w:t>
+      </w:r>
+      <w:proofErr w:type="gramStart"/>
+      <w:r>
+        <w:t>), but</w:t>
+      </w:r>
+      <w:proofErr w:type="gramEnd"/>
+      <w:r>
+        <w:t xml:space="preserve"> are expected to discuss the reasons behind this choice of architecture.</w:t>
       </w:r>
     </w:p>
     <w:p>
@@ -997,7 +1349,15 @@
         <w:t>train sets</w:t>
       </w:r>
       <w:r>
-        <w:t>, but also on your test set. It is also strongly advised to think about other relevant performance metrics, such as accuracy, recall, etc. An example of a (very minimal) display is given in the screenshot below. You may use the datetime and/or tqdm libraries if you see fit.</w:t>
+        <w:t xml:space="preserve">, but also on your test set. It is also strongly advised to think about other relevant performance metrics, such as accuracy, recall, etc. An example of a (very minimal) display is given in the screenshot below. You may use the datetime and/or </w:t>
+      </w:r>
+      <w:proofErr w:type="spellStart"/>
+      <w:r>
+        <w:t>tqdm</w:t>
+      </w:r>
+      <w:proofErr w:type="spellEnd"/>
+      <w:r>
+        <w:t xml:space="preserve"> libraries if you see fit.</w:t>
       </w:r>
     </w:p>
     <w:p>
@@ -1024,7 +1384,7 @@
                     <pic:cNvPicPr/>
                   </pic:nvPicPr>
                   <pic:blipFill>
-                    <a:blip r:embed="rId13">
+                    <a:blip r:embed="rId11">
                       <a:extLst>
                         <a:ext uri="{28A0092B-C50C-407E-A947-70E740481C1C}">
                           <a14:useLocalDpi xmlns:a14="http://schemas.microsoft.com/office/drawing/2010/main" val="0"/>
@@ -1108,147 +1468,44 @@
         </w:numPr>
       </w:pPr>
       <w:r>
-        <w:t>You are expected to provide learning curves showing the evolution of your loss function and your other performance metrics over your successive training epochs for both your train and test sets. An example of such a graph is given in the screenshot below.</w:t>
-      </w:r>
-    </w:p>
-    <w:p>
-      <w:pPr>
-        <w:jc w:val="center"/>
-      </w:pPr>
+        <w:t>You are expected to provide learning curves showing the evolution of your loss function and your other performance metrics over your successive training epochs for both your train and test sets.</w:t>
+      </w:r>
+    </w:p>
+    <w:p>
+      <w:pPr>
+        <w:pStyle w:val="ListParagraph"/>
+        <w:numPr>
+          <w:ilvl w:val="0"/>
+          <w:numId w:val="3"/>
+        </w:numPr>
+      </w:pPr>
+      <w:r>
+        <w:t>After a complete training, you are expected to display the performance of your trained model on the 24 images in the validation set. We expect to see a subplot that looks like this and contains relevant information quantifying the performance of your model. Typically, ground truth and predicted labels for all 24 images, and possible overall metrics (</w:t>
+      </w:r>
+      <w:r>
+        <w:t>A</w:t>
+      </w:r>
+      <w:r>
+        <w:t>ccuracy?</w:t>
+      </w:r>
+      <w:r>
+        <w:t xml:space="preserve"> Other metrics?</w:t>
+      </w:r>
+      <w:r>
+        <w:t>).</w:t>
+      </w:r>
+    </w:p>
+    <w:p>
       <w:r>
         <w:rPr>
           <w:noProof/>
         </w:rPr>
-        <mc:AlternateContent>
-          <mc:Choice Requires="wps">
-            <w:drawing>
-              <wp:anchor distT="0" distB="0" distL="114300" distR="114300" simplePos="0" relativeHeight="251659264" behindDoc="0" locked="0" layoutInCell="1" allowOverlap="1" wp14:anchorId="7C9CF9A9" wp14:editId="33CCBE37">
-                <wp:simplePos x="0" y="0"/>
-                <wp:positionH relativeFrom="column">
-                  <wp:posOffset>4214191</wp:posOffset>
-                </wp:positionH>
-                <wp:positionV relativeFrom="paragraph">
-                  <wp:posOffset>866692</wp:posOffset>
-                </wp:positionV>
-                <wp:extent cx="1486894" cy="946205"/>
-                <wp:effectExtent l="0" t="0" r="18415" b="25400"/>
-                <wp:wrapNone/>
-                <wp:docPr id="4" name="Text Box 4"/>
-                <wp:cNvGraphicFramePr/>
-                <a:graphic xmlns:a="http://schemas.openxmlformats.org/drawingml/2006/main">
-                  <a:graphicData uri="http://schemas.microsoft.com/office/word/2010/wordprocessingShape">
-                    <wps:wsp>
-                      <wps:cNvSpPr txBox="1"/>
-                      <wps:spPr>
-                        <a:xfrm>
-                          <a:off x="0" y="0"/>
-                          <a:ext cx="1486894" cy="946205"/>
-                        </a:xfrm>
-                        <a:prstGeom prst="rect">
-                          <a:avLst/>
-                        </a:prstGeom>
-                        <a:solidFill>
-                          <a:schemeClr val="lt1"/>
-                        </a:solidFill>
-                        <a:ln w="6350">
-                          <a:solidFill>
-                            <a:prstClr val="black"/>
-                          </a:solidFill>
-                        </a:ln>
-                      </wps:spPr>
-                      <wps:txbx>
-                        <w:txbxContent>
-                          <w:p>
-                            <w:pPr>
-                              <w:rPr>
-                                <w:lang w:val="en-US"/>
-                              </w:rPr>
-                            </w:pPr>
-                            <w:r>
-                              <w:rPr>
-                                <w:lang w:val="en-US"/>
-                              </w:rPr>
-                              <w:t>What should these curves be?</w:t>
-                            </w:r>
-                          </w:p>
-                          <w:p>
-                            <w:pPr>
-                              <w:rPr>
-                                <w:lang w:val="en-US"/>
-                              </w:rPr>
-                            </w:pPr>
-                            <w:r>
-                              <w:rPr>
-                                <w:lang w:val="en-US"/>
-                              </w:rPr>
-                              <w:t>Are these good enough?</w:t>
-                            </w:r>
-                          </w:p>
-                        </w:txbxContent>
-                      </wps:txbx>
-                      <wps:bodyPr rot="0" spcFirstLastPara="0" vertOverflow="overflow" horzOverflow="overflow" vert="horz" wrap="square" lIns="91440" tIns="45720" rIns="91440" bIns="45720" numCol="1" spcCol="0" rtlCol="0" fromWordArt="0" anchor="t" anchorCtr="0" forceAA="0" compatLnSpc="1">
-                        <a:prstTxWarp prst="textNoShape">
-                          <a:avLst/>
-                        </a:prstTxWarp>
-                        <a:noAutofit/>
-                      </wps:bodyPr>
-                    </wps:wsp>
-                  </a:graphicData>
-                </a:graphic>
-              </wp:anchor>
-            </w:drawing>
-          </mc:Choice>
-          <mc:Fallback>
-            <w:pict>
-              <v:shapetype w14:anchorId="7C9CF9A9" id="_x0000_t202" coordsize="21600,21600" o:spt="202" path="m,l,21600r21600,l21600,xe">
-                <v:stroke joinstyle="miter"/>
-                <v:path gradientshapeok="t" o:connecttype="rect"/>
-              </v:shapetype>
-              <v:shape id="Text Box 4" o:spid="_x0000_s1026" type="#_x0000_t202" style="position:absolute;left:0;text-align:left;margin-left:331.85pt;margin-top:68.25pt;width:117.1pt;height:74.5pt;z-index:251659264;visibility:visible;mso-wrap-style:square;mso-wrap-distance-left:9pt;mso-wrap-distance-top:0;mso-wrap-distance-right:9pt;mso-wrap-distance-bottom:0;mso-position-horizontal:absolute;mso-position-horizontal-relative:text;mso-position-vertical:absolute;mso-position-vertical-relative:text;v-text-anchor:top" o:gfxdata="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" fillcolor="white [3201]" strokeweight=".5pt">
-                <v:textbox>
-                  <w:txbxContent>
-                    <w:p>
-                      <w:pPr>
-                        <w:rPr>
-                          <w:lang w:val="en-US"/>
-                        </w:rPr>
-                      </w:pPr>
-                      <w:r>
-                        <w:rPr>
-                          <w:lang w:val="en-US"/>
-                        </w:rPr>
-                        <w:t>What should these curves be?</w:t>
-                      </w:r>
-                    </w:p>
-                    <w:p>
-                      <w:pPr>
-                        <w:rPr>
-                          <w:lang w:val="en-US"/>
-                        </w:rPr>
-                      </w:pPr>
-                      <w:r>
-                        <w:rPr>
-                          <w:lang w:val="en-US"/>
-                        </w:rPr>
-                        <w:t>Are these good enough?</w:t>
-                      </w:r>
-                    </w:p>
-                  </w:txbxContent>
-                </v:textbox>
-              </v:shape>
-            </w:pict>
-          </mc:Fallback>
-        </mc:AlternateContent>
-      </w:r>
-      <w:r>
-        <w:rPr>
-          <w:noProof/>
-        </w:rPr>
+        <w:lastRenderedPageBreak/>
         <w:drawing>
-          <wp:inline distT="0" distB="0" distL="0" distR="0" wp14:anchorId="0ADAA21D" wp14:editId="43F09D16">
-            <wp:extent cx="5731510" cy="2913380"/>
-            <wp:effectExtent l="0" t="0" r="2540" b="1270"/>
-            <wp:docPr id="3" name="Picture 3"/>
+          <wp:inline distT="0" distB="0" distL="0" distR="0" wp14:anchorId="09B1D1F0" wp14:editId="11F9EBDD">
+            <wp:extent cx="5420765" cy="4486275"/>
+            <wp:effectExtent l="0" t="0" r="8890" b="0"/>
+            <wp:docPr id="5" name="Picture 5"/>
             <wp:cNvGraphicFramePr>
               <a:graphicFrameLocks xmlns:a="http://schemas.openxmlformats.org/drawingml/2006/main" noChangeAspect="1"/>
             </wp:cNvGraphicFramePr>
@@ -1256,11 +1513,11 @@
               <a:graphicData uri="http://schemas.openxmlformats.org/drawingml/2006/picture">
                 <pic:pic xmlns:pic="http://schemas.openxmlformats.org/drawingml/2006/picture">
                   <pic:nvPicPr>
-                    <pic:cNvPr id="3" name="Picture 3"/>
+                    <pic:cNvPr id="5" name="Picture 5"/>
                     <pic:cNvPicPr/>
                   </pic:nvPicPr>
                   <pic:blipFill>
-                    <a:blip r:embed="rId14">
+                    <a:blip r:embed="rId12">
                       <a:extLst>
                         <a:ext uri="{28A0092B-C50C-407E-A947-70E740481C1C}">
                           <a14:useLocalDpi xmlns:a14="http://schemas.microsoft.com/office/drawing/2010/main" val="0"/>
@@ -1274,7 +1531,7 @@
                   <pic:spPr>
                     <a:xfrm>
                       <a:off x="0" y="0"/>
-                      <a:ext cx="5731510" cy="2913380"/>
+                      <a:ext cx="5421870" cy="4487190"/>
                     </a:xfrm>
                     <a:prstGeom prst="rect">
                       <a:avLst/>
@@ -1287,11 +1544,6 @@
         </w:drawing>
       </w:r>
     </w:p>
-    <w:p>
-      <w:pPr>
-        <w:pStyle w:val="ListParagraph"/>
-      </w:pPr>
-    </w:p>
     <w:p/>
     <w:p>
       <w:pPr>
@@ -1302,71 +1554,9 @@
         </w:numPr>
       </w:pPr>
       <w:r>
-        <w:lastRenderedPageBreak/>
-        <w:t>After a complete training, you are expected to display the performance of your trained model on the 24 images in the validation set. We expect to see a subplot that looks like this and contains relevant information quantifying the performance of your model. Typically, ground truth and predicted labels for all 24 images, and possible overall metrics (</w:t>
-      </w:r>
-      <w:r>
-        <w:t>A</w:t>
-      </w:r>
-      <w:r>
-        <w:t>ccuracy?</w:t>
-      </w:r>
-      <w:r>
-        <w:t xml:space="preserve"> Other metrics?</w:t>
-      </w:r>
-      <w:r>
-        <w:t>).</w:t>
-      </w:r>
-    </w:p>
-    <w:p>
-      <w:r>
-        <w:rPr>
-          <w:noProof/>
-        </w:rPr>
-        <w:drawing>
-          <wp:inline distT="0" distB="0" distL="0" distR="0" wp14:anchorId="09B1D1F0" wp14:editId="7B1B4FB5">
-            <wp:extent cx="5731510" cy="4743450"/>
-            <wp:effectExtent l="0" t="0" r="2540" b="0"/>
-            <wp:docPr id="5" name="Picture 5"/>
-            <wp:cNvGraphicFramePr>
-              <a:graphicFrameLocks xmlns:a="http://schemas.openxmlformats.org/drawingml/2006/main" noChangeAspect="1"/>
-            </wp:cNvGraphicFramePr>
-            <a:graphic xmlns:a="http://schemas.openxmlformats.org/drawingml/2006/main">
-              <a:graphicData uri="http://schemas.openxmlformats.org/drawingml/2006/picture">
-                <pic:pic xmlns:pic="http://schemas.openxmlformats.org/drawingml/2006/picture">
-                  <pic:nvPicPr>
-                    <pic:cNvPr id="5" name="Picture 5"/>
-                    <pic:cNvPicPr/>
-                  </pic:nvPicPr>
-                  <pic:blipFill>
-                    <a:blip r:embed="rId15">
-                      <a:extLst>
-                        <a:ext uri="{28A0092B-C50C-407E-A947-70E740481C1C}">
-                          <a14:useLocalDpi xmlns:a14="http://schemas.microsoft.com/office/drawing/2010/main" val="0"/>
-                        </a:ext>
-                      </a:extLst>
-                    </a:blip>
-                    <a:stretch>
-                      <a:fillRect/>
-                    </a:stretch>
-                  </pic:blipFill>
-                  <pic:spPr>
-                    <a:xfrm>
-                      <a:off x="0" y="0"/>
-                      <a:ext cx="5731510" cy="4743450"/>
-                    </a:xfrm>
-                    <a:prstGeom prst="rect">
-                      <a:avLst/>
-                    </a:prstGeom>
-                  </pic:spPr>
-                </pic:pic>
-              </a:graphicData>
-            </a:graphic>
-          </wp:inline>
-        </w:drawing>
-      </w:r>
-    </w:p>
-    <w:p/>
+        <w:t>You might find it more difficult to differentiate between non-covid and covid x-rays, rather than between normal x-rays and infected (both covid and non-covid) people x-rays. Was that something to be expected? Discuss.</w:t>
+      </w:r>
+    </w:p>
     <w:p>
       <w:pPr>
         <w:pStyle w:val="ListParagraph"/>
@@ -1376,7 +1566,37 @@
         </w:numPr>
       </w:pPr>
       <w:r>
-        <w:t>You might find it more difficult to differentiate between non-covid and covid x-rays, rather than between normal x-rays and infected (both covid and non-covid) people x-rays. Was that something to be expected? Discuss.</w:t>
+        <w:t xml:space="preserve">Final question: </w:t>
+      </w:r>
+      <w:r>
+        <w:t>would</w:t>
+      </w:r>
+      <w:r>
+        <w:t xml:space="preserve"> it be better to have a model with high overall accuracy or low true negatives/false positives rates</w:t>
+      </w:r>
+      <w:r>
+        <w:t xml:space="preserve"> on certain classes</w:t>
+      </w:r>
+      <w:r>
+        <w:t>?</w:t>
+      </w:r>
+      <w:r>
+        <w:t xml:space="preserve"> Discuss.</w:t>
+      </w:r>
+    </w:p>
+    <w:p/>
+    <w:p>
+      <w:pPr>
+        <w:pStyle w:val="Heading2"/>
+      </w:pPr>
+      <w:r>
+        <w:t>Bonuses</w:t>
+      </w:r>
+    </w:p>
+    <w:p/>
+    <w:p>
+      <w:r>
+        <w:t>Below is a list of non-mandatory questions, which might yield bonus points if implemented and correctly discussed.</w:t>
       </w:r>
     </w:p>
     <w:p>
@@ -1388,37 +1608,10 @@
         </w:numPr>
       </w:pPr>
       <w:r>
-        <w:t xml:space="preserve">Final question: </w:t>
-      </w:r>
-      <w:r>
-        <w:t>would</w:t>
-      </w:r>
-      <w:r>
-        <w:t xml:space="preserve"> it be better to have a model with high overall accuracy or low true negatives/false positives rates</w:t>
-      </w:r>
-      <w:r>
-        <w:t xml:space="preserve"> on certain classes</w:t>
-      </w:r>
-      <w:r>
-        <w:t>?</w:t>
-      </w:r>
-      <w:r>
-        <w:t xml:space="preserve"> Discuss.</w:t>
-      </w:r>
-    </w:p>
-    <w:p/>
-    <w:p>
-      <w:pPr>
-        <w:pStyle w:val="Heading2"/>
-      </w:pPr>
-      <w:r>
-        <w:t>Bonuses</w:t>
-      </w:r>
-    </w:p>
-    <w:p/>
-    <w:p>
-      <w:r>
-        <w:t>Below is a list of non-mandatory questions, which might yield bonus points if implemented and correctly discussed.</w:t>
+        <w:t>Implementing and discussing a learning rate scheduler</w:t>
+      </w:r>
+      <w:r>
+        <w:t xml:space="preserve"> and discuss its appropriate choice of parameters and benefits for your model.</w:t>
       </w:r>
     </w:p>
     <w:p>
@@ -1430,10 +1623,7 @@
         </w:numPr>
       </w:pPr>
       <w:r>
-        <w:t>Implementing and discussing a learning rate scheduler</w:t>
-      </w:r>
-      <w:r>
-        <w:t xml:space="preserve"> and discuss its appropriate choice of parameters and benefits for your model.</w:t>
+        <w:t>Implementing a regularization on your loss function and discuss its appropriate choice of parameters and benefits for your model.</w:t>
       </w:r>
     </w:p>
     <w:p>
@@ -1445,8 +1635,15 @@
         </w:numPr>
       </w:pPr>
       <w:r>
-        <w:lastRenderedPageBreak/>
-        <w:t>Implementing a regularization on your loss function and discuss its appropriate choice of parameters and benefits for your model.</w:t>
+        <w:t xml:space="preserve">Briefly look up online how doctors diagnose infections based on x-rays. Does our AI seem to be able to reproduce this </w:t>
+      </w:r>
+      <w:proofErr w:type="spellStart"/>
+      <w:r>
+        <w:t>behavior</w:t>
+      </w:r>
+      <w:proofErr w:type="spellEnd"/>
+      <w:r>
+        <w:t xml:space="preserve"> correctly? Show typical samples of the dataset on which your AI failed and discuss what might have been the reasons. </w:t>
       </w:r>
     </w:p>
     <w:p>
@@ -1458,18 +1655,6 @@
         </w:numPr>
       </w:pPr>
       <w:r>
-        <w:t xml:space="preserve">Briefly look up online how doctors diagnose infections based on x-rays. Does our AI seem to be able to reproduce this behavior correctly? Show typical samples of the dataset on which your AI failed and discuss what might have been the reasons. </w:t>
-      </w:r>
-    </w:p>
-    <w:p>
-      <w:pPr>
-        <w:pStyle w:val="ListParagraph"/>
-        <w:numPr>
-          <w:ilvl w:val="0"/>
-          <w:numId w:val="3"/>
-        </w:numPr>
-      </w:pPr>
-      <w:r>
         <w:t>Feature maps visuals could also be interesting.</w:t>
       </w:r>
     </w:p>
@@ -1503,46 +1688,100 @@
     </w:p>
     <w:p/>
     <w:p>
-      <w:r>
-        <w:t>Groups of 2-3 people</w:t>
-      </w:r>
-      <w:r>
+      <w:pPr>
+        <w:rPr>
+          <w:b/>
+          <w:bCs/>
+        </w:rPr>
+      </w:pPr>
+      <w:r>
+        <w:rPr>
+          <w:b/>
+          <w:bCs/>
+        </w:rPr>
+        <w:t xml:space="preserve">Submission deadline: </w:t>
+      </w:r>
+      <w:r>
+        <w:rPr>
+          <w:b/>
+          <w:bCs/>
+        </w:rPr>
+        <w:t>Sunday 3</w:t>
+      </w:r>
+      <w:r>
+        <w:rPr>
+          <w:b/>
+          <w:bCs/>
+          <w:vertAlign w:val="superscript"/>
+        </w:rPr>
+        <w:t>rd</w:t>
+      </w:r>
+      <w:r>
+        <w:rPr>
+          <w:b/>
+          <w:bCs/>
+        </w:rPr>
+        <w:t xml:space="preserve"> May 2026, 11.59pm</w:t>
+      </w:r>
+      <w:r>
+        <w:rPr>
+          <w:b/>
+          <w:bCs/>
+        </w:rPr>
         <w:t>.</w:t>
       </w:r>
-    </w:p>
-    <w:p>
-      <w:pPr>
-        <w:rPr>
-          <w:b/>
-          <w:bCs/>
-        </w:rPr>
-      </w:pPr>
-      <w:r>
-        <w:rPr>
-          <w:b/>
-          <w:bCs/>
-        </w:rPr>
-        <w:t xml:space="preserve">Submission deadline: </w:t>
-      </w:r>
-      <w:commentRangeStart w:id="2"/>
-      <w:r>
-        <w:rPr>
-          <w:b/>
-          <w:bCs/>
-        </w:rPr>
-        <w:t>XXX</w:t>
-      </w:r>
-      <w:commentRangeEnd w:id="2"/>
-      <w:r>
-        <w:rPr>
-          <w:rStyle w:val="CommentReference"/>
-          <w:b/>
-          <w:bCs/>
-          <w:sz w:val="22"/>
-          <w:szCs w:val="22"/>
-        </w:rPr>
-        <w:commentReference w:id="2"/>
-      </w:r>
+      <w:r>
+        <w:rPr>
+          <w:b/>
+          <w:bCs/>
+        </w:rPr>
+        <w:t xml:space="preserve"> Please </w:t>
+      </w:r>
+      <w:r>
+        <w:rPr>
+          <w:b/>
+          <w:bCs/>
+        </w:rPr>
+        <w:t>submit</w:t>
+      </w:r>
+      <w:r>
+        <w:rPr>
+          <w:b/>
+          <w:bCs/>
+        </w:rPr>
+        <w:t xml:space="preserve"> </w:t>
+      </w:r>
+      <w:r>
+        <w:rPr>
+          <w:b/>
+          <w:bCs/>
+        </w:rPr>
+        <w:t xml:space="preserve">your project </w:t>
+      </w:r>
+      <w:r>
+        <w:rPr>
+          <w:b/>
+          <w:bCs/>
+        </w:rPr>
+        <w:t>(code/notebooks + PDFs, but no dataset due to space restrictions)</w:t>
+      </w:r>
+      <w:r>
+        <w:rPr>
+          <w:b/>
+          <w:bCs/>
+        </w:rPr>
+        <w:t xml:space="preserve"> via email at </w:t>
+      </w:r>
+      <w:hyperlink r:id="rId13" w:history="1">
+        <w:r>
+          <w:rPr>
+            <w:rStyle w:val="Hyperlink"/>
+            <w:b/>
+            <w:bCs/>
+          </w:rPr>
+          <w:t>matthieu_demari@sutd.edu.sg</w:t>
+        </w:r>
+      </w:hyperlink>
       <w:r>
         <w:rPr>
           <w:b/>
@@ -1551,6 +1790,50 @@
         <w:t>.</w:t>
       </w:r>
     </w:p>
+    <w:p>
+      <w:pPr>
+        <w:rPr>
+          <w:b/>
+          <w:bCs/>
+        </w:rPr>
+      </w:pPr>
+      <w:r>
+        <w:rPr>
+          <w:b/>
+          <w:bCs/>
+        </w:rPr>
+        <w:t>There will also be a small p</w:t>
+      </w:r>
+      <w:r>
+        <w:rPr>
+          <w:b/>
+          <w:bCs/>
+        </w:rPr>
+        <w:t xml:space="preserve">resentation of your project </w:t>
+      </w:r>
+      <w:r>
+        <w:rPr>
+          <w:b/>
+          <w:bCs/>
+        </w:rPr>
+        <w:t>on the 8</w:t>
+      </w:r>
+      <w:r>
+        <w:rPr>
+          <w:b/>
+          <w:bCs/>
+          <w:vertAlign w:val="superscript"/>
+        </w:rPr>
+        <w:t>th</w:t>
+      </w:r>
+      <w:r>
+        <w:rPr>
+          <w:b/>
+          <w:bCs/>
+        </w:rPr>
+        <w:t xml:space="preserve"> of May, details to follow later.</w:t>
+      </w:r>
+    </w:p>
     <w:p/>
     <w:p>
       <w:pPr>
@@ -1568,7 +1851,39 @@
     </w:p>
     <w:p>
       <w:r>
-        <w:t>You code may consists of .py files, ipynb jupyter notebooks, or Google Colab notebooks.</w:t>
+        <w:t>You code may consists of .</w:t>
+      </w:r>
+      <w:proofErr w:type="spellStart"/>
+      <w:r>
+        <w:t>py</w:t>
+      </w:r>
+      <w:proofErr w:type="spellEnd"/>
+      <w:r>
+        <w:t xml:space="preserve"> files, </w:t>
+      </w:r>
+      <w:proofErr w:type="spellStart"/>
+      <w:r>
+        <w:t>ipynb</w:t>
+      </w:r>
+      <w:proofErr w:type="spellEnd"/>
+      <w:r>
+        <w:t xml:space="preserve"> </w:t>
+      </w:r>
+      <w:proofErr w:type="spellStart"/>
+      <w:r>
+        <w:t>jupyter</w:t>
+      </w:r>
+      <w:proofErr w:type="spellEnd"/>
+      <w:r>
+        <w:t xml:space="preserve"> notebooks, or Google </w:t>
+      </w:r>
+      <w:proofErr w:type="spellStart"/>
+      <w:r>
+        <w:t>Colab</w:t>
+      </w:r>
+      <w:proofErr w:type="spellEnd"/>
+      <w:r>
+        <w:t xml:space="preserve"> notebooks.</w:t>
       </w:r>
       <w:r>
         <w:t xml:space="preserve"> Your PDF report should explicitly mention what needs to be done to run your code.</w:t>
@@ -1582,7 +1897,31 @@
         <w:t>they are</w:t>
       </w:r>
       <w:r>
-        <w:t xml:space="preserve"> good practice!). Personally (Matt), I believe the most presentable format is a Jupyter Notebook, combining MarkDown cells and code cells, along with .py files containing the largest parts of your code</w:t>
+        <w:t xml:space="preserve"> good practice!). Personally (Matt), I believe the most presentable format is a </w:t>
+      </w:r>
+      <w:proofErr w:type="spellStart"/>
+      <w:r>
+        <w:t>Jupyter</w:t>
+      </w:r>
+      <w:proofErr w:type="spellEnd"/>
+      <w:r>
+        <w:t xml:space="preserve"> Notebook, combining </w:t>
+      </w:r>
+      <w:proofErr w:type="spellStart"/>
+      <w:r>
+        <w:t>MarkDown</w:t>
+      </w:r>
+      <w:proofErr w:type="spellEnd"/>
+      <w:r>
+        <w:t xml:space="preserve"> cells and code cells, along with .</w:t>
+      </w:r>
+      <w:proofErr w:type="spellStart"/>
+      <w:r>
+        <w:t>py</w:t>
+      </w:r>
+      <w:proofErr w:type="spellEnd"/>
+      <w:r>
+        <w:t xml:space="preserve"> files containing the largest parts of your code</w:t>
       </w:r>
       <w:r>
         <w:t>: y</w:t>
@@ -1591,10 +1930,26 @@
         <w:t xml:space="preserve">ou </w:t>
       </w:r>
       <w:r>
-        <w:t xml:space="preserve">just have to </w:t>
-      </w:r>
-      <w:r>
-        <w:t>import them later in your Jupyter Notebook, to minimize the amount of code in your Notebook!</w:t>
+        <w:t xml:space="preserve">just </w:t>
+      </w:r>
+      <w:proofErr w:type="gramStart"/>
+      <w:r>
+        <w:t>have to</w:t>
+      </w:r>
+      <w:proofErr w:type="gramEnd"/>
+      <w:r>
+        <w:t xml:space="preserve"> </w:t>
+      </w:r>
+      <w:r>
+        <w:t xml:space="preserve">import them later in your </w:t>
+      </w:r>
+      <w:proofErr w:type="spellStart"/>
+      <w:r>
+        <w:t>Jupyter</w:t>
+      </w:r>
+      <w:proofErr w:type="spellEnd"/>
+      <w:r>
+        <w:t xml:space="preserve"> Notebook, to minimize the amount of code in your Notebook!</w:t>
       </w:r>
     </w:p>
     <w:p/>
@@ -1608,22 +1963,79 @@
     </w:p>
     <w:p/>
     <w:p>
-      <w:r>
-        <w:t>We strongly advise to upload your submission (code/notebooks + PDFs, but no dataset due to space restrictions) on a Github repository.</w:t>
-      </w:r>
-      <w:r>
-        <w:t xml:space="preserve"> You can then submit the link to your PUBLIC Github repository, during your submission on edimension.</w:t>
-      </w:r>
-    </w:p>
-    <w:p>
-      <w:r>
-        <w:t>Your Github repository for this project should contain your PDF report, your DOCUMENTED code/notebook files. I</w:t>
+      <w:pPr>
+        <w:rPr>
+          <w:b/>
+          <w:bCs/>
+        </w:rPr>
+      </w:pPr>
+      <w:r>
+        <w:t xml:space="preserve">Please submit </w:t>
+      </w:r>
+      <w:r>
+        <w:t xml:space="preserve">submission (code/notebooks + PDFs, but no dataset due to space restrictions) </w:t>
+      </w:r>
+      <w:r>
+        <w:t xml:space="preserve">via email at </w:t>
+      </w:r>
+      <w:hyperlink r:id="rId14" w:history="1">
+        <w:r>
+          <w:rPr>
+            <w:rStyle w:val="Hyperlink"/>
+          </w:rPr>
+          <w:t>matthieu_demari@sutd.edu.sg</w:t>
+        </w:r>
+      </w:hyperlink>
+      <w:r>
+        <w:t>.</w:t>
+      </w:r>
+    </w:p>
+    <w:p>
+      <w:r>
+        <w:t xml:space="preserve">You can then submit the link to your PUBLIC </w:t>
+      </w:r>
+      <w:proofErr w:type="spellStart"/>
+      <w:r>
+        <w:t>Github</w:t>
+      </w:r>
+      <w:proofErr w:type="spellEnd"/>
+      <w:r>
+        <w:t xml:space="preserve"> repository, during your submission on </w:t>
+      </w:r>
+      <w:proofErr w:type="spellStart"/>
+      <w:r>
+        <w:t>edimension</w:t>
+      </w:r>
+      <w:proofErr w:type="spellEnd"/>
+      <w:r>
+        <w:t>.</w:t>
+      </w:r>
+    </w:p>
+    <w:p>
+      <w:r>
+        <w:t xml:space="preserve">Your </w:t>
+      </w:r>
+      <w:proofErr w:type="spellStart"/>
+      <w:r>
+        <w:t>Github</w:t>
+      </w:r>
+      <w:proofErr w:type="spellEnd"/>
+      <w:r>
+        <w:t xml:space="preserve"> repository for this project should contain your PDF report, your DOCUMENTED code/notebook files. I</w:t>
       </w:r>
       <w:r>
         <w:t>t</w:t>
       </w:r>
       <w:r>
-        <w:t xml:space="preserve"> should also contain directions showing the required libraries and steps needed to re-train the model from scratch. And more importantly, it should also contain clear directions on how to recreate the exact trained model and its performance results you are presenting in the PDF, by loading some save PyTorch weights for your model. This is essential, for reproducibility reasons and something that we, researchers, </w:t>
+        <w:t xml:space="preserve"> should also contain directions showing the required libraries and steps needed to re-train the model from scratch. And more importantly, it should also contain clear directions on how to recreate the exact trained model and its performance results you are presenting in the PDF, by loading some save </w:t>
+      </w:r>
+      <w:proofErr w:type="spellStart"/>
+      <w:r>
+        <w:t>PyTorch</w:t>
+      </w:r>
+      <w:proofErr w:type="spellEnd"/>
+      <w:r>
+        <w:t xml:space="preserve"> weights for your model. This is essential, for reproducibility reasons and something that we, researchers, </w:t>
       </w:r>
       <w:r>
         <w:t>must</w:t>
@@ -1633,12 +2045,12 @@
       </w:r>
     </w:p>
     <w:sectPr>
-      <w:headerReference w:type="even" r:id="rId16"/>
-      <w:headerReference w:type="default" r:id="rId17"/>
-      <w:footerReference w:type="even" r:id="rId18"/>
-      <w:footerReference w:type="default" r:id="rId19"/>
-      <w:headerReference w:type="first" r:id="rId20"/>
-      <w:footerReference w:type="first" r:id="rId21"/>
+      <w:headerReference w:type="even" r:id="rId15"/>
+      <w:headerReference w:type="default" r:id="rId16"/>
+      <w:footerReference w:type="even" r:id="rId17"/>
+      <w:footerReference w:type="default" r:id="rId18"/>
+      <w:headerReference w:type="first" r:id="rId19"/>
+      <w:footerReference w:type="first" r:id="rId20"/>
       <w:pgSz w:w="11906" w:h="16838"/>
       <w:pgMar w:top="1440" w:right="1440" w:bottom="1440" w:left="1440" w:header="708" w:footer="708" w:gutter="0"/>
       <w:cols w:space="708"/>
@@ -1646,92 +2058,6 @@
     </w:sectPr>
   </w:body>
 </w:document>
-</file>
-
-<file path=word/comments.xml><?xml version="1.0" encoding="utf-8"?>
-<w:comments xmlns:wpc="http://schemas.microsoft.com/office/word/2010/wordprocessingCanvas" xmlns:cx="http://schemas.microsoft.com/office/drawing/2014/chartex" xmlns:cx1="http://schemas.microsoft.com/office/drawing/2015/9/8/chartex" xmlns:cx2="http://schemas.microsoft.com/office/drawing/2015/10/21/chartex" xmlns:cx3="http://schemas.microsoft.com/office/drawing/2016/5/9/chartex" xmlns:cx4="http://schemas.microsoft.com/office/drawing/2016/5/10/chartex" xmlns:cx5="http://schemas.microsoft.com/office/drawing/2016/5/11/chartex" xmlns:cx6="http://schemas.microsoft.com/office/drawing/2016/5/12/chartex" xmlns:cx7="http://schemas.microsoft.com/office/drawing/2016/5/13/chartex" xmlns:cx8="http://schemas.microsoft.com/office/drawing/2016/5/14/chartex" xmlns:mc="http://schemas.openxmlformats.org/markup-compatibility/2006" xmlns:aink="http://schemas.microsoft.com/office/drawing/2016/ink" xmlns:am3d="http://schemas.microsoft.com/office/drawing/2017/model3d" xmlns:o="urn:schemas-microsoft-com:office:office" xmlns:oel="http://schemas.microsoft.com/office/2019/extlst" xmlns:r="http://schemas.openxmlformats.org/officeDocument/2006/relationships" xmlns:m="http://schemas.openxmlformats.org/officeDocument/2006/math" xmlns:v="urn:schemas-microsoft-com:vml" xmlns:wp14="http://schemas.microsoft.com/office/word/2010/wordprocessingDrawing" xmlns:wp="http://schemas.openxmlformats.org/drawingml/2006/wordprocessingDrawing" xmlns:w10="urn:schemas-microsoft-com:office:word" xmlns:w="http://schemas.openxmlformats.org/wordprocessingml/2006/main" xmlns:w14="http://schemas.microsoft.com/office/word/2010/wordml" xmlns:w15="http://schemas.microsoft.com/office/word/2012/wordml" xmlns:w16cex="http://schemas.microsoft.com/office/word/2018/wordml/cex" xmlns:w16cid="http://schemas.microsoft.com/office/word/2016/wordml/cid" xmlns:w16="http://schemas.microsoft.com/office/word/2018/wordml" xmlns:w16du="http://schemas.microsoft.com/office/word/2023/wordml/word16du" xmlns:w16sdtdh="http://schemas.microsoft.com/office/word/2020/wordml/sdtdatahash" xmlns:w16sdtfl="http://schemas.microsoft.com/office/word/2024/wordml/sdtformatlock" xmlns:w16se="http://schemas.microsoft.com/office/word/2015/wordml/symex" xmlns:wpg="http://schemas.microsoft.com/office/word/2010/wordprocessingGroup" xmlns:wpi="http://schemas.microsoft.com/office/word/2010/wordprocessingInk" xmlns:wne="http://schemas.microsoft.com/office/word/2006/wordml" xmlns:wps="http://schemas.microsoft.com/office/word/2010/wordprocessingShape" mc:Ignorable="w14 w15 w16se w16cid w16 w16cex w16sdtdh w16sdtfl w16du wp14">
-  <w:comment w:id="0" w:author="Matthieu De Mari" w:date="2026-02-19T14:27:00Z" w:initials="MD">
-    <w:p>
-      <w:pPr>
-        <w:pStyle w:val="CommentText"/>
-      </w:pPr>
-      <w:r>
-        <w:rPr>
-          <w:rStyle w:val="CommentReference"/>
-        </w:rPr>
-        <w:annotationRef/>
-      </w:r>
-      <w:r>
-        <w:rPr>
-          <w:lang w:val="fr-FR"/>
-        </w:rPr>
-        <w:t>Update</w:t>
-      </w:r>
-    </w:p>
-  </w:comment>
-  <w:comment w:id="1" w:author="Matthieu De Mari" w:date="2026-02-19T14:25:00Z" w:initials="MD">
-    <w:p>
-      <w:pPr>
-        <w:pStyle w:val="CommentText"/>
-      </w:pPr>
-      <w:r>
-        <w:rPr>
-          <w:rStyle w:val="CommentReference"/>
-        </w:rPr>
-        <w:annotationRef/>
-      </w:r>
-      <w:r>
-        <w:rPr>
-          <w:lang w:val="fr-FR"/>
-        </w:rPr>
-        <w:t>Link needs to be updated</w:t>
-      </w:r>
-    </w:p>
-  </w:comment>
-  <w:comment w:id="2" w:author="Matthieu De Mari" w:date="2026-02-19T14:27:00Z" w:initials="MD">
-    <w:p>
-      <w:pPr>
-        <w:pStyle w:val="CommentText"/>
-      </w:pPr>
-      <w:r>
-        <w:rPr>
-          <w:rStyle w:val="CommentReference"/>
-        </w:rPr>
-        <w:annotationRef/>
-      </w:r>
-      <w:r>
-        <w:rPr>
-          <w:lang w:val="fr-FR"/>
-        </w:rPr>
-        <w:t>Update</w:t>
-      </w:r>
-    </w:p>
-  </w:comment>
-</w:comments>
-</file>
-
-<file path=word/commentsExtended.xml><?xml version="1.0" encoding="utf-8"?>
-<w15:commentsEx xmlns:wpc="http://schemas.microsoft.com/office/word/2010/wordprocessingCanvas" xmlns:cx="http://schemas.microsoft.com/office/drawing/2014/chartex" xmlns:cx1="http://schemas.microsoft.com/office/drawing/2015/9/8/chartex" xmlns:cx2="http://schemas.microsoft.com/office/drawing/2015/10/21/chartex" xmlns:cx3="http://schemas.microsoft.com/office/drawing/2016/5/9/chartex" xmlns:cx4="http://schemas.microsoft.com/office/drawing/2016/5/10/chartex" xmlns:cx5="http://schemas.microsoft.com/office/drawing/2016/5/11/chartex" xmlns:cx6="http://schemas.microsoft.com/office/drawing/2016/5/12/chartex" xmlns:cx7="http://schemas.microsoft.com/office/drawing/2016/5/13/chartex" xmlns:cx8="http://schemas.microsoft.com/office/drawing/2016/5/14/chartex" xmlns:mc="http://schemas.openxmlformats.org/markup-compatibility/2006" xmlns:aink="http://schemas.microsoft.com/office/drawing/2016/ink" xmlns:am3d="http://schemas.microsoft.com/office/drawing/2017/model3d" xmlns:o="urn:schemas-microsoft-com:office:office" xmlns:oel="http://schemas.microsoft.com/office/2019/extlst" xmlns:r="http://schemas.openxmlformats.org/officeDocument/2006/relationships" xmlns:m="http://schemas.openxmlformats.org/officeDocument/2006/math" xmlns:v="urn:schemas-microsoft-com:vml" xmlns:wp14="http://schemas.microsoft.com/office/word/2010/wordprocessingDrawing" xmlns:wp="http://schemas.openxmlformats.org/drawingml/2006/wordprocessingDrawing" xmlns:w10="urn:schemas-microsoft-com:office:word" xmlns:w="http://schemas.openxmlformats.org/wordprocessingml/2006/main" xmlns:w14="http://schemas.microsoft.com/office/word/2010/wordml" xmlns:w15="http://schemas.microsoft.com/office/word/2012/wordml" xmlns:w16cex="http://schemas.microsoft.com/office/word/2018/wordml/cex" xmlns:w16cid="http://schemas.microsoft.com/office/word/2016/wordml/cid" xmlns:w16="http://schemas.microsoft.com/office/word/2018/wordml" xmlns:w16du="http://schemas.microsoft.com/office/word/2023/wordml/word16du" xmlns:w16sdtdh="http://schemas.microsoft.com/office/word/2020/wordml/sdtdatahash" xmlns:w16sdtfl="http://schemas.microsoft.com/office/word/2024/wordml/sdtformatlock" xmlns:w16se="http://schemas.microsoft.com/office/word/2015/wordml/symex" xmlns:wpg="http://schemas.microsoft.com/office/word/2010/wordprocessingGroup" xmlns:wpi="http://schemas.microsoft.com/office/word/2010/wordprocessingInk" xmlns:wne="http://schemas.microsoft.com/office/word/2006/wordml" xmlns:wps="http://schemas.microsoft.com/office/word/2010/wordprocessingShape" mc:Ignorable="w14 w15 w16se w16cid w16 w16cex w16sdtdh w16sdtfl w16du wp14">
-  <w15:commentEx w15:paraId="09A615A3" w15:done="0"/>
-  <w15:commentEx w15:paraId="579CE94D" w15:done="0"/>
-  <w15:commentEx w15:paraId="11CA1D9B" w15:done="0"/>
-</w15:commentsEx>
-</file>
-
-<file path=word/commentsExtensible.xml><?xml version="1.0" encoding="utf-8"?>
-<w16cex:commentsExtensible xmlns:wpc="http://schemas.microsoft.com/office/word/2010/wordprocessingCanvas" xmlns:cx="http://schemas.microsoft.com/office/drawing/2014/chartex" xmlns:cx1="http://schemas.microsoft.com/office/drawing/2015/9/8/chartex" xmlns:cx2="http://schemas.microsoft.com/office/drawing/2015/10/21/chartex" xmlns:cx3="http://schemas.microsoft.com/office/drawing/2016/5/9/chartex" xmlns:cx4="http://schemas.microsoft.com/office/drawing/2016/5/10/chartex" xmlns:cx5="http://schemas.microsoft.com/office/drawing/2016/5/11/chartex" xmlns:cx6="http://schemas.microsoft.com/office/drawing/2016/5/12/chartex" xmlns:cx7="http://schemas.microsoft.com/office/drawing/2016/5/13/chartex" xmlns:cx8="http://schemas.microsoft.com/office/drawing/2016/5/14/chartex" xmlns:cr="http://schemas.microsoft.com/office/comments/2020/reactions" xmlns:mc="http://schemas.openxmlformats.org/markup-compatibility/2006" xmlns:aink="http://schemas.microsoft.com/office/drawing/2016/ink" xmlns:am3d="http://schemas.microsoft.com/office/drawing/2017/model3d" xmlns:o="urn:schemas-microsoft-com:office:office" xmlns:oel="http://schemas.microsoft.com/office/2019/extlst" xmlns:r="http://schemas.openxmlformats.org/officeDocument/2006/relationships" xmlns:m="http://schemas.openxmlformats.org/officeDocument/2006/math" xmlns:v="urn:schemas-microsoft-com:vml" xmlns:wp14="http://schemas.microsoft.com/office/word/2010/wordprocessingDrawing" xmlns:wp="http://schemas.openxmlformats.org/drawingml/2006/wordprocessingDrawing" xmlns:w10="urn:schemas-microsoft-com:office:word" xmlns:w="http://schemas.openxmlformats.org/wordprocessingml/2006/main" xmlns:w14="http://schemas.microsoft.com/office/word/2010/wordml" xmlns:w15="http://schemas.microsoft.com/office/word/2012/wordml" xmlns:w16cex="http://schemas.microsoft.com/office/word/2018/wordml/cex" xmlns:w16cid="http://schemas.microsoft.com/office/word/2016/wordml/cid" xmlns:w16="http://schemas.microsoft.com/office/word/2018/wordml" xmlns:w16du="http://schemas.microsoft.com/office/word/2023/wordml/word16du" xmlns:w16sdtdh="http://schemas.microsoft.com/office/word/2020/wordml/sdtdatahash" xmlns:w16sdtfl="http://schemas.microsoft.com/office/word/2024/wordml/sdtformatlock" xmlns:w16se="http://schemas.microsoft.com/office/word/2015/wordml/symex" xmlns:wpg="http://schemas.microsoft.com/office/word/2010/wordprocessingGroup" xmlns:wpi="http://schemas.microsoft.com/office/word/2010/wordprocessingInk" xmlns:wne="http://schemas.microsoft.com/office/word/2006/wordml" xmlns:wps="http://schemas.microsoft.com/office/word/2010/wordprocessingShape" mc:Ignorable="w14 w15 w16se w16cid w16 w16cex w16sdtdh w16sdtfl cr w16du wp14">
-  <w16cex:commentExtensible w16cex:durableId="34FC351C" w16cex:dateUtc="2026-02-19T06:27:00Z"/>
-  <w16cex:commentExtensible w16cex:durableId="361AE525" w16cex:dateUtc="2026-02-19T06:25:00Z"/>
-  <w16cex:commentExtensible w16cex:durableId="64D3C21C" w16cex:dateUtc="2026-02-19T06:27:00Z"/>
-</w16cex:commentsExtensible>
-</file>
-
-<file path=word/commentsIds.xml><?xml version="1.0" encoding="utf-8"?>
-<w16cid:commentsIds xmlns:wpc="http://schemas.microsoft.com/office/word/2010/wordprocessingCanvas" xmlns:cx="http://schemas.microsoft.com/office/drawing/2014/chartex" xmlns:cx1="http://schemas.microsoft.com/office/drawing/2015/9/8/chartex" xmlns:cx2="http://schemas.microsoft.com/office/drawing/2015/10/21/chartex" xmlns:cx3="http://schemas.microsoft.com/office/drawing/2016/5/9/chartex" xmlns:cx4="http://schemas.microsoft.com/office/drawing/2016/5/10/chartex" xmlns:cx5="http://schemas.microsoft.com/office/drawing/2016/5/11/chartex" xmlns:cx6="http://schemas.microsoft.com/office/drawing/2016/5/12/chartex" xmlns:cx7="http://schemas.microsoft.com/office/drawing/2016/5/13/chartex" xmlns:cx8="http://schemas.microsoft.com/office/drawing/2016/5/14/chartex" xmlns:mc="http://schemas.openxmlformats.org/markup-compatibility/2006" xmlns:aink="http://schemas.microsoft.com/office/drawing/2016/ink" xmlns:am3d="http://schemas.microsoft.com/office/drawing/2017/model3d" xmlns:o="urn:schemas-microsoft-com:office:office" xmlns:oel="http://schemas.microsoft.com/office/2019/extlst" xmlns:r="http://schemas.openxmlformats.org/officeDocument/2006/relationships" xmlns:m="http://schemas.openxmlformats.org/officeDocument/2006/math" xmlns:v="urn:schemas-microsoft-com:vml" xmlns:wp14="http://schemas.microsoft.com/office/word/2010/wordprocessingDrawing" xmlns:wp="http://schemas.openxmlformats.org/drawingml/2006/wordprocessingDrawing" xmlns:w10="urn:schemas-microsoft-com:office:word" xmlns:w="http://schemas.openxmlformats.org/wordprocessingml/2006/main" xmlns:w14="http://schemas.microsoft.com/office/word/2010/wordml" xmlns:w15="http://schemas.microsoft.com/office/word/2012/wordml" xmlns:w16cex="http://schemas.microsoft.com/office/word/2018/wordml/cex" xmlns:w16cid="http://schemas.microsoft.com/office/word/2016/wordml/cid" xmlns:w16="http://schemas.microsoft.com/office/word/2018/wordml" xmlns:w16du="http://schemas.microsoft.com/office/word/2023/wordml/word16du" xmlns:w16sdtdh="http://schemas.microsoft.com/office/word/2020/wordml/sdtdatahash" xmlns:w16sdtfl="http://schemas.microsoft.com/office/word/2024/wordml/sdtformatlock" xmlns:w16se="http://schemas.microsoft.com/office/word/2015/wordml/symex" xmlns:wpg="http://schemas.microsoft.com/office/word/2010/wordprocessingGroup" xmlns:wpi="http://schemas.microsoft.com/office/word/2010/wordprocessingInk" xmlns:wne="http://schemas.microsoft.com/office/word/2006/wordml" xmlns:wps="http://schemas.microsoft.com/office/word/2010/wordprocessingShape" mc:Ignorable="w14 w15 w16se w16cid w16 w16cex w16sdtdh w16sdtfl w16du wp14">
-  <w16cid:commentId w16cid:paraId="09A615A3" w16cid:durableId="34FC351C"/>
-  <w16cid:commentId w16cid:paraId="579CE94D" w16cid:durableId="361AE525"/>
-  <w16cid:commentId w16cid:paraId="11CA1D9B" w16cid:durableId="64D3C21C"/>
-</w16cid:commentsIds>
 </file>
 
 <file path=word/endnotes.xml><?xml version="1.0" encoding="utf-8"?>
@@ -2899,14 +3225,6 @@
     </w:lvlOverride>
   </w:num>
 </w:numbering>
-</file>
-
-<file path=word/people.xml><?xml version="1.0" encoding="utf-8"?>
-<w15:people xmlns:wpc="http://schemas.microsoft.com/office/word/2010/wordprocessingCanvas" xmlns:cx="http://schemas.microsoft.com/office/drawing/2014/chartex" xmlns:cx1="http://schemas.microsoft.com/office/drawing/2015/9/8/chartex" xmlns:cx2="http://schemas.microsoft.com/office/drawing/2015/10/21/chartex" xmlns:cx3="http://schemas.microsoft.com/office/drawing/2016/5/9/chartex" xmlns:cx4="http://schemas.microsoft.com/office/drawing/2016/5/10/chartex" xmlns:cx5="http://schemas.microsoft.com/office/drawing/2016/5/11/chartex" xmlns:cx6="http://schemas.microsoft.com/office/drawing/2016/5/12/chartex" xmlns:cx7="http://schemas.microsoft.com/office/drawing/2016/5/13/chartex" xmlns:cx8="http://schemas.microsoft.com/office/drawing/2016/5/14/chartex" xmlns:mc="http://schemas.openxmlformats.org/markup-compatibility/2006" xmlns:aink="http://schemas.microsoft.com/office/drawing/2016/ink" xmlns:am3d="http://schemas.microsoft.com/office/drawing/2017/model3d" xmlns:o="urn:schemas-microsoft-com:office:office" xmlns:oel="http://schemas.microsoft.com/office/2019/extlst" xmlns:r="http://schemas.openxmlformats.org/officeDocument/2006/relationships" xmlns:m="http://schemas.openxmlformats.org/officeDocument/2006/math" xmlns:v="urn:schemas-microsoft-com:vml" xmlns:wp14="http://schemas.microsoft.com/office/word/2010/wordprocessingDrawing" xmlns:wp="http://schemas.openxmlformats.org/drawingml/2006/wordprocessingDrawing" xmlns:w10="urn:schemas-microsoft-com:office:word" xmlns:w="http://schemas.openxmlformats.org/wordprocessingml/2006/main" xmlns:w14="http://schemas.microsoft.com/office/word/2010/wordml" xmlns:w15="http://schemas.microsoft.com/office/word/2012/wordml" xmlns:w16cex="http://schemas.microsoft.com/office/word/2018/wordml/cex" xmlns:w16cid="http://schemas.microsoft.com/office/word/2016/wordml/cid" xmlns:w16="http://schemas.microsoft.com/office/word/2018/wordml" xmlns:w16du="http://schemas.microsoft.com/office/word/2023/wordml/word16du" xmlns:w16sdtdh="http://schemas.microsoft.com/office/word/2020/wordml/sdtdatahash" xmlns:w16sdtfl="http://schemas.microsoft.com/office/word/2024/wordml/sdtformatlock" xmlns:w16se="http://schemas.microsoft.com/office/word/2015/wordml/symex" xmlns:wpg="http://schemas.microsoft.com/office/word/2010/wordprocessingGroup" xmlns:wpi="http://schemas.microsoft.com/office/word/2010/wordprocessingInk" xmlns:wne="http://schemas.microsoft.com/office/word/2006/wordml" xmlns:wps="http://schemas.microsoft.com/office/word/2010/wordprocessingShape" mc:Ignorable="w14 w15 w16se w16cid w16 w16cex w16sdtdh w16sdtfl w16du wp14">
-  <w15:person w15:author="Matthieu De Mari">
-    <w15:presenceInfo w15:providerId="AD" w15:userId="S::matthieu_demari@sutd.edu.sg::dfb708c9-d8dc-439f-9a3b-c772bf4a311c"/>
-  </w15:person>
-</w15:people>
 </file>
 
 <file path=word/styles.xml><?xml version="1.0" encoding="utf-8"?>
@@ -3660,6 +3978,18 @@
       <w:szCs w:val="20"/>
     </w:rPr>
   </w:style>
+  <w:style w:type="character" w:styleId="FollowedHyperlink">
+    <w:name w:val="FollowedHyperlink"/>
+    <w:basedOn w:val="DefaultParagraphFont"/>
+    <w:uiPriority w:val="99"/>
+    <w:semiHidden/>
+    <w:unhideWhenUsed/>
+    <w:rsid w:val="00DD6935"/>
+    <w:rPr>
+      <w:color w:val="954F72" w:themeColor="followedHyperlink"/>
+      <w:u w:val="single"/>
+    </w:rPr>
+  </w:style>
 </w:styles>
 </file>
 

</xml_diff>